<commit_message>
fix(compliance): patch cross-volume inconsistencies in 0B/2A/2B/2C/3A/0D
- 3A: fix RMM adaptation time V1A-02/30-60min -> V1A-04/45-60min (align 1A)
- 3A: fix V3A-03 SNs peak frequency 20-50Hz -> ~20Hz (<30Hz upper; 50Hz+ is CNs)
- 3A: annotate V3A-04 CPD as foveal vision; cross-ref V2C-02 for peripheral
- 3A: add V2C-XX block to Inherited_Baseline (V2C-02/04/07); update header
- 2A: add B0-02/03/08/11 citation codes to Inherited_Baseline bullets
- 2B: restructure Inherited_Baseline from single para to B0-01~14 itemized list
- 2C: annotate 0.10-0.18 CPD as full-field/peripheral in V2C-02 and prose
- 0D: add formal Carry_Forward_To_Downstream block (1A/1B/2A/2B inheritance map)
- 0B: add Scope Declaration; annotate 6 fish-behavior paragraphs with [-> 4A]

Add PATCH_NOTES.md with full change record.

Co-authored-by: Copilot <223556219+Copilot@users.noreply.github.com>
</commit_message>
<xml_diff>
--- a/0B_南北成土母質與地球化學基底.docx
+++ b/0B_南北成土母質與地球化學基底.docx
@@ -52,27 +52,10 @@
         </w:rPr>
       </w:pPr>
       <w:r>
-        <w:rPr>
-          <w:rFonts w:ascii="Google Sans" w:eastAsia="Google Sans" w:hAnsi="Google Sans" w:cs="Google Sans"/>
-          <w:color w:val="1F1F1F"/>
-        </w:rPr>
-        <w:t>台灣島嶼位處歐亞板塊與菲律賓海板塊之交界，活躍的造山運動與板塊擠壓，配合亞熱帶至熱帶季風氣候的高溫多雨條件，雕塑出極度複雜且異質性極高的地表土壤分布。在此一宏觀地理架構下，內陸淡水水域（包含水庫、天然湖泊、埤塘及河川中下游）的底質沉積物與周邊集水區的成土母質（Soil Parent Materials），深刻地主導了水體的物理化學參數基底。對於身為頂級視覺掠食者的大嘴黑鱸（</w:t>
-      </w:r>
-      <w:r>
-        <w:rPr>
-          <w:rFonts w:ascii="Google Sans" w:eastAsia="Google Sans" w:hAnsi="Google Sans" w:cs="Google Sans"/>
-          <w:i/>
-          <w:iCs/>
-          <w:color w:val="1F1F1F"/>
-        </w:rPr>
-        <w:t>Micropterus salmoides</w:t>
-      </w:r>
-      <w:r>
-        <w:rPr>
-          <w:rFonts w:ascii="Google Sans" w:eastAsia="Google Sans" w:hAnsi="Google Sans" w:cs="Google Sans"/>
-          <w:color w:val="1F1F1F"/>
-        </w:rPr>
-        <w:t>）而言，其棲地適宜性、繁殖行為學、覓食效率以及稚魚存活率，皆被這層無形的地球化學網絡所嚴密控制。</w:t>
+        <w:t>台灣島嶼位處歐亞板塊與菲律賓海板塊之交界，活躍的造山運動與板塊擠壓，配合亞熱帶至熱帶季風氣候的高溫多雨條件，雕塑出極度複雜且異質性極高的地表土壤分布。在此一宏觀地理架構下，內陸淡水水域（包含水庫、天然湖泊、埤塘及河川中下游）的底質沉積物與周邊集水區的成土母質（Soil Parent Materials），深刻地主導了水體的物理化學參數基底。對於身為頂級視覺掠食者的大嘴黑鱸（Micropterus salmoides）而言，其棲地適宜性、繁殖行為學、覓食效率以及稚魚存活率，皆被這層無形的地球化學網絡所嚴密控制。</w:t>
+        <w:br/>
+        <w:br/>
+        <w:t>【Scope Declaration — 卷 0B】本卷核心發現嚴格限定於地球化學基底（pH、Eh、絮凝動力學、Fe/H₂S 氧化還原）。文中提及大嘴黑鱸之視覺狩獵、覓食半徑及繁衍行為，均為地球化學環境重要性之背景脈絡說明（motivation context），非本卷研究範疇。相關行為機制詳見卷 1B/2A（非繁衍期）、卷 4A（繁衍期）。</w:t>
       </w:r>
     </w:p>
     <w:p>
@@ -205,19 +188,9 @@
         </w:rPr>
       </w:pPr>
       <w:r>
-        <w:rPr>
-          <w:rFonts w:ascii="Google Sans" w:eastAsia="Google Sans" w:hAnsi="Google Sans" w:cs="Google Sans"/>
-          <w:color w:val="1F1F1F"/>
-        </w:rPr>
-        <w:t>大嘴黑鱸的生態學需求與這些地球化學參數存在高度的耦合關係。作為一種高度依賴視覺感官來鎖定、追蹤與突襲獵物的魚類，水體的透光度（Secchi depth）與濁度（Turbidity）直接決定了其索餌半徑與能量獲取效率。此外，在每年春季的繁殖期，雄性黑鱸會於水深 0.5 公尺至 1.5 公</w:t>
-      </w:r>
-      <w:r>
-        <w:rPr>
-          <w:rFonts w:ascii="Google Sans" w:eastAsia="Google Sans" w:hAnsi="Google Sans" w:cs="Google Sans"/>
-          <w:color w:val="1F1F1F"/>
-        </w:rPr>
-        <w:lastRenderedPageBreak/>
-        <w:t>尺的淺水區構築碟型產卵巢穴。巢穴底層沉積物的微環境（Microenvironment）—包括滲透壓、孔隙水離子強度、溶解氧消耗率以及硫化氫毒性風險—將直接裁決受精卵的孵化率與仔魚的早期存活率。因此，要精確建構台灣大嘴黑鱸的棲地適宜性預測模型，必須深入剖析極育土與新成土在物理化學參數上的微觀力學機制。</w:t>
+        <w:t>大嘴黑鱸的生態學需求與這些地球化學參數存在高度的耦合關係。作為一種高度依賴視覺感官來鎖定、追蹤與突襲獵物的魚類，水體的透光度（Secchi depth）與濁度（Turbidity）直接決定了其索餌半徑與能量獲取效率。此外，在每年春季的繁殖期，雄性黑鱸會於水深 0.5 公尺至 1.5 公尺的淺水區構築碟型產卵巢穴。巢穴底層沉積物的微環境（Microenvironment）—包括滲透壓、孔隙水離子強度、溶解氧消耗率以及硫化氫毒性風險—將直接裁決受精卵的孵化率與仔魚的早期存活率。因此，要精確建構台灣大嘴黑鱸的棲地適宜性預測模型，必須深入剖析極育土與新成土在物理化學參數上的微觀力學機制。</w:t>
+        <w:br/>
+        <w:t>【Scope Note: 魚類行為/繁衍機制詳見卷 1B/2A/4A；本段提及之生態需求僅作地球化學研究動機，非本卷核心發現。】</w:t>
       </w:r>
     </w:p>
     <w:p>
@@ -1975,11 +1948,9 @@
         </w:rPr>
       </w:pPr>
       <w:r>
-        <w:rPr>
-          <w:rFonts w:ascii="Google Sans" w:eastAsia="Google Sans" w:hAnsi="Google Sans" w:cs="Google Sans"/>
-          <w:color w:val="1F1F1F"/>
-        </w:rPr>
         <w:t>大嘴黑鱸的繁衍盛典深刻綁定於淺水域的底棲微環境。每年初春至孟夏，雄性黑鱸會游移至岸際水深 0.5 公尺至 1.5 公尺的區域，利用強有力的尾鰭掃視底床，清除浮泥與有機碎屑，暴露出堅實的底層沙礫或壓實的黏土層以作為產卵巢穴。在這個特定的深度區間，土壤水分的垂直運移機制、溶質傳輸路徑（Solute transport paths）以及強烈的蒸發濃縮效應（Evaporative concentration），共同形塑了受精卵孵化與稚魚早期發育的化學溫床。</w:t>
+        <w:br/>
+        <w:t>【→ 卷 4A: 繁衍地球化學與水文干擾】</w:t>
       </w:r>
     </w:p>
     <w:p>
@@ -2186,11 +2157,9 @@
         </w:rPr>
       </w:pPr>
       <w:r>
-        <w:rPr>
-          <w:rFonts w:ascii="Google Sans" w:eastAsia="Google Sans" w:hAnsi="Google Sans" w:cs="Google Sans"/>
-          <w:color w:val="1F1F1F"/>
-        </w:rPr>
         <w:t>在台灣南部具備顯著旱雨季交替的氣候條件下，大嘴黑鱸的春季產卵期恰逢旱季尾聲。此時水庫與埤塘的水位降至低點，淺水區（0.8m 深度的築巢區）水溫攀升，日照輻射強烈。在這種物理環境下，發生了劇烈的「蒸發濃縮效應」（Evaporative concentration）。</w:t>
+        <w:br/>
+        <w:t>【→ 卷 4A: 繁衍地球化學與水文干擾】</w:t>
       </w:r>
     </w:p>
     <w:p>
@@ -2323,11 +2292,9 @@
         </w:rPr>
       </w:pPr>
       <w:r>
-        <w:rPr>
-          <w:rFonts w:ascii="Google Sans" w:eastAsia="Google Sans" w:hAnsi="Google Sans" w:cs="Google Sans"/>
-          <w:color w:val="1F1F1F"/>
-        </w:rPr>
         <w:t>對於大嘴黑鱸的繁殖成功率而言，0.8m 深度的蒸發濃縮效應是一把生態學上的雙面刃。在有益的一面，鈣離子（Ca²⁺）濃度的局部上升，是仔魚卵外膜（Chorion）硬化與胚胎骨骼發育的不可或缺元素；同時，底層沉積物的陽離子架橋硬化，為魚卵提供了穩固的附著基質，減少了被水流沖刷或掩埋的風險。然而，在致命的另一面，過度的蒸發濃縮可能導致孔隙水的滲透壓（Osmotic pressure）飆升，突破受精卵的生理調節極限，引發胚胎脫水壞死。更甚者，伴隨農業逕流進入的硫酸鹽（SO₄²⁻）若在 0.8m 深度大量累積，將為後續的厭氧毒理學災變埋下伏筆。反觀北部極育土環境，由於母質歷經百萬年淋溶，鈣、鎂、硫的初始本底濃度極低，即便經歷春季蒸發濃縮，其離子強度的峰值也難以構成滲透壓逆境；但其潛在風險則轉移至鋁離子（Al³⁺）在酸性環境下的濃縮毒性，可能干擾仔魚鰓部上皮細胞的離子交換功能。</w:t>
+        <w:br/>
+        <w:t>【→ 卷 4A: 繁衍地球化學與水文干擾】</w:t>
       </w:r>
     </w:p>
     <w:p>
@@ -2363,11 +2330,9 @@
         </w:rPr>
       </w:pPr>
       <w:r>
-        <w:rPr>
-          <w:rFonts w:ascii="Google Sans" w:eastAsia="Google Sans" w:hAnsi="Google Sans" w:cs="Google Sans"/>
-          <w:color w:val="1F1F1F"/>
-        </w:rPr>
         <w:t>底泥-水界面的氧化還原電位（Redox Potential, Eh）是裁決水質化學形態演變及大嘴黑鱸稚魚底棲存活率的終極熱力學參數。Eh 動力學本質上是元素間電子轉移過程的宏觀體現，且與水體的 pH 值存在緊密的熱力學耦合關係（可透過能斯特方程式 Nernst Equation 描述其 Eh-pH 依存性）。</w:t>
+        <w:br/>
+        <w:t>【→ 卷 4A: 繁衍地球化學與水文干擾】</w:t>
       </w:r>
     </w:p>
     <w:p>
@@ -2795,109 +2760,9 @@
         </w:rPr>
       </w:pPr>
       <w:r>
-        <w:rPr>
-          <w:rFonts w:ascii="Google Sans" w:eastAsia="Google Sans" w:hAnsi="Google Sans" w:cs="Google Sans"/>
-          <w:color w:val="1F1F1F"/>
-        </w:rPr>
-        <w:t xml:space="preserve">大嘴黑鱸的繁殖週期受水溫變化的絕對控制，其性腺成熟與築巢產卵行為通常需要水溫穩定跨越 15°C 至 18°C 的閾值。作為佔據水體下半部與巢穴基底的龐大實體，底質沉積物實質上扮演著一個巨大的熱能儲存庫與釋放源。沉積物的體積熱容（Volumetric Heat Capacity, </w:t>
-      </w:r>
-      <w:r>
-        <w:rPr>
-          <w:rFonts w:ascii="Google Sans" w:eastAsia="Google Sans" w:hAnsi="Google Sans" w:cs="Google Sans"/>
-          <w:noProof/>
-          <w:color w:val="1F1F1F"/>
-        </w:rPr>
-        <w:drawing>
-          <wp:inline distT="19050" distB="19050" distL="19050" distR="19050" wp14:anchorId="54C83B74" wp14:editId="209DB65F">
-            <wp:extent cx="208211" cy="227139"/>
-            <wp:effectExtent l="0" t="0" r="0" b="0"/>
-            <wp:docPr id="34" name="image9.png"/>
-            <wp:cNvGraphicFramePr/>
-            <a:graphic xmlns:a="http://schemas.openxmlformats.org/drawingml/2006/main">
-              <a:graphicData uri="http://schemas.openxmlformats.org/drawingml/2006/picture">
-                <pic:pic xmlns:pic="http://schemas.openxmlformats.org/drawingml/2006/picture">
-                  <pic:nvPicPr>
-                    <pic:cNvPr id="0" name="image9.png"/>
-                    <pic:cNvPicPr preferRelativeResize="0"/>
-                  </pic:nvPicPr>
-                  <pic:blipFill>
-                    <a:blip r:embed="rId21"/>
-                    <a:srcRect/>
-                    <a:stretch>
-                      <a:fillRect/>
-                    </a:stretch>
-                  </pic:blipFill>
-                  <pic:spPr>
-                    <a:xfrm>
-                      <a:off x="0" y="0"/>
-                      <a:ext cx="208211" cy="227139"/>
-                    </a:xfrm>
-                    <a:prstGeom prst="rect">
-                      <a:avLst/>
-                    </a:prstGeom>
-                    <a:ln/>
-                  </pic:spPr>
-                </pic:pic>
-              </a:graphicData>
-            </a:graphic>
-          </wp:inline>
-        </w:drawing>
-      </w:r>
-      <w:r>
-        <w:rPr>
-          <w:rFonts w:ascii="Google Sans" w:eastAsia="Google Sans" w:hAnsi="Google Sans" w:cs="Google Sans"/>
-          <w:color w:val="1F1F1F"/>
-        </w:rPr>
-        <w:t xml:space="preserve">）與熱擴散係數（Thermal Diffusivity, </w:t>
-      </w:r>
-      <w:r>
-        <w:rPr>
-          <w:rFonts w:ascii="Google Sans" w:eastAsia="Google Sans" w:hAnsi="Google Sans" w:cs="Google Sans"/>
-          <w:noProof/>
-          <w:color w:val="1F1F1F"/>
-        </w:rPr>
-        <w:drawing>
-          <wp:inline distT="19050" distB="19050" distL="19050" distR="19050" wp14:anchorId="5D6A1D32" wp14:editId="4AEEFA54">
-            <wp:extent cx="179933" cy="227284"/>
-            <wp:effectExtent l="0" t="0" r="0" b="0"/>
-            <wp:docPr id="35" name="image26.png"/>
-            <wp:cNvGraphicFramePr/>
-            <a:graphic xmlns:a="http://schemas.openxmlformats.org/drawingml/2006/main">
-              <a:graphicData uri="http://schemas.openxmlformats.org/drawingml/2006/picture">
-                <pic:pic xmlns:pic="http://schemas.openxmlformats.org/drawingml/2006/picture">
-                  <pic:nvPicPr>
-                    <pic:cNvPr id="0" name="image26.png"/>
-                    <pic:cNvPicPr preferRelativeResize="0"/>
-                  </pic:nvPicPr>
-                  <pic:blipFill>
-                    <a:blip r:embed="rId22"/>
-                    <a:srcRect/>
-                    <a:stretch>
-                      <a:fillRect/>
-                    </a:stretch>
-                  </pic:blipFill>
-                  <pic:spPr>
-                    <a:xfrm>
-                      <a:off x="0" y="0"/>
-                      <a:ext cx="179933" cy="227284"/>
-                    </a:xfrm>
-                    <a:prstGeom prst="rect">
-                      <a:avLst/>
-                    </a:prstGeom>
-                    <a:ln/>
-                  </pic:spPr>
-                </pic:pic>
-              </a:graphicData>
-            </a:graphic>
-          </wp:inline>
-        </w:drawing>
-      </w:r>
-      <w:r>
-        <w:rPr>
-          <w:rFonts w:ascii="Google Sans" w:eastAsia="Google Sans" w:hAnsi="Google Sans" w:cs="Google Sans"/>
-          <w:color w:val="1F1F1F"/>
-        </w:rPr>
-        <w:t>），嚴密地掌控了巢穴微氣候的季節性升溫速率以及日夜溫差（Diurnal temperature range）的劇烈程度。</w:t>
+        <w:t>大嘴黑鱸的繁殖週期受水溫變化的絕對控制，其性腺成熟與築巢產卵行為通常需要水溫穩定跨越 15°C 至 18°C 的閾值。作為佔據水體下半部與巢穴基底的龐大實體，底質沉積物實質上扮演著一個巨大的熱能儲存庫與釋放源。沉積物的體積熱容（Volumetric Heat Capacity, ）與熱擴散係數（Thermal Diffusivity, ），嚴密地掌控了巢穴微氣候的季節性升溫速率以及日夜溫差（Diurnal temperature range）的劇烈程度。</w:t>
+        <w:br/>
+        <w:t>【→ 卷 4A: 繁衍地球化學與水文干擾；本段底泥熱容量化結果詳見 0B-11/0B-12。】</w:t>
       </w:r>
     </w:p>
     <w:p>

</xml_diff>